<commit_message>
ISO W10 sapuan form OPS: OPS-FRM-03, OPS-FRM-06
Lolos gerbang mesin W10 dan pemeriksa bahasa buta (semua skor >= 4).
Ledger: insiden batas paralel subagen dicatat.

Co-Authored-By: Claude Opus 5.5 <noreply@anthropic.com>
Claude-Session: https://claude.ai/code/session_01BhkCQM7h3krZb9kjY2Nate
</commit_message>
<xml_diff>
--- a/out/07_Ops/SNX-OPS-FRM-03 Project Progress Monitoring Report (Rev00 DRAFT).docx
+++ b/out/07_Ops/SNX-OPS-FRM-03 Project Progress Monitoring Report (Rev00 DRAFT).docx
@@ -217,6 +217,7 @@
     <w:p>
       <w:pPr>
         <w:pStyle w:val="Heading1"/>
+        <w:keepNext/>
         <w:widowControl w:val="0"/>
         <w:spacing w:line="240" w:lineRule="auto"/>
         <w:ind w:right="407" w:firstLine="0"/>
@@ -511,6 +512,10 @@
         <w:gridCol w:w="5850"/>
       </w:tblGrid>
       <w:tr>
+        <w:trPr>
+          <w:cantSplit/>
+          <w:tblHeader/>
+        </w:trPr>
         <w:tc>
           <w:tcPr>
             <w:tcW w:w="3150" w:type="dxa"/>
@@ -523,6 +528,7 @@
           </w:tcPr>
           <w:p>
             <w:pPr>
+              <w:keepNext/>
               <w:widowControl w:val="0"/>
               <w:pBdr>
                 <w:top w:val="nil"/>
@@ -563,6 +569,7 @@
           </w:tcPr>
           <w:p>
             <w:pPr>
+              <w:keepNext/>
               <w:widowControl w:val="0"/>
               <w:pBdr>
                 <w:top w:val="nil"/>
@@ -593,6 +600,9 @@
         </w:tc>
       </w:tr>
       <w:tr>
+        <w:trPr>
+          <w:cantSplit/>
+        </w:trPr>
         <w:tc>
           <w:tcPr>
             <w:tcW w:w="3150" w:type="dxa"/>
@@ -646,6 +656,9 @@
         </w:tc>
       </w:tr>
       <w:tr>
+        <w:trPr>
+          <w:cantSplit/>
+        </w:trPr>
         <w:tc>
           <w:tcPr>
             <w:tcW w:w="3150" w:type="dxa"/>
@@ -699,6 +712,9 @@
         </w:tc>
       </w:tr>
       <w:tr>
+        <w:trPr>
+          <w:cantSplit/>
+        </w:trPr>
         <w:tc>
           <w:tcPr>
             <w:tcW w:w="3150" w:type="dxa"/>
@@ -750,6 +766,9 @@
         </w:tc>
       </w:tr>
       <w:tr>
+        <w:trPr>
+          <w:cantSplit/>
+        </w:trPr>
         <w:tc>
           <w:tcPr>
             <w:tcW w:w="3150" w:type="dxa"/>
@@ -810,6 +829,9 @@
         </w:tc>
       </w:tr>
       <w:tr>
+        <w:trPr>
+          <w:cantSplit/>
+        </w:trPr>
         <w:tc>
           <w:tcPr>
             <w:tcW w:w="3150" w:type="dxa"/>
@@ -861,6 +883,9 @@
         </w:tc>
       </w:tr>
       <w:tr>
+        <w:trPr>
+          <w:cantSplit/>
+        </w:trPr>
         <w:tc>
           <w:tcPr>
             <w:tcW w:w="3150" w:type="dxa"/>
@@ -914,6 +939,9 @@
         </w:tc>
       </w:tr>
       <w:tr>
+        <w:trPr>
+          <w:cantSplit/>
+        </w:trPr>
         <w:tc>
           <w:tcPr>
             <w:tcW w:w="3150" w:type="dxa"/>
@@ -967,6 +995,9 @@
         </w:tc>
       </w:tr>
       <w:tr>
+        <w:trPr>
+          <w:cantSplit/>
+        </w:trPr>
         <w:tc>
           <w:tcPr>
             <w:tcW w:w="3150" w:type="dxa"/>
@@ -1020,6 +1051,9 @@
         </w:tc>
       </w:tr>
       <w:tr>
+        <w:trPr>
+          <w:cantSplit/>
+        </w:trPr>
         <w:tc>
           <w:tcPr>
             <w:tcW w:w="3150" w:type="dxa"/>
@@ -1073,6 +1107,9 @@
         </w:tc>
       </w:tr>
       <w:tr>
+        <w:trPr>
+          <w:cantSplit/>
+        </w:trPr>
         <w:tc>
           <w:tcPr>
             <w:tcW w:w="3150" w:type="dxa"/>
@@ -1126,6 +1163,9 @@
         </w:tc>
       </w:tr>
       <w:tr>
+        <w:trPr>
+          <w:cantSplit/>
+        </w:trPr>
         <w:tc>
           <w:tcPr>
             <w:tcW w:w="3150" w:type="dxa"/>
@@ -1207,6 +1247,7 @@
     <w:p>
       <w:pPr>
         <w:pStyle w:val="Heading1"/>
+        <w:keepNext/>
         <w:widowControl w:val="0"/>
         <w:spacing w:before="816" w:line="240" w:lineRule="auto"/>
         <w:ind w:right="407"/>
@@ -1243,6 +1284,10 @@
         <w:gridCol w:w="3010"/>
       </w:tblGrid>
       <w:tr>
+        <w:trPr>
+          <w:cantSplit/>
+          <w:tblHeader/>
+        </w:trPr>
         <w:tc>
           <w:tcPr>
             <w:tcW w:w="3009" w:type="dxa"/>
@@ -1255,6 +1300,7 @@
           </w:tcPr>
           <w:p>
             <w:pPr>
+              <w:keepNext/>
               <w:widowControl w:val="0"/>
               <w:spacing w:line="240" w:lineRule="auto"/>
               <w:jc w:val="center"/>
@@ -1288,6 +1334,7 @@
           </w:tcPr>
           <w:p>
             <w:pPr>
+              <w:keepNext/>
               <w:widowControl w:val="0"/>
               <w:spacing w:line="240" w:lineRule="auto"/>
               <w:jc w:val="center"/>
@@ -1321,6 +1368,7 @@
           </w:tcPr>
           <w:p>
             <w:pPr>
+              <w:keepNext/>
               <w:widowControl w:val="0"/>
               <w:spacing w:line="240" w:lineRule="auto"/>
               <w:jc w:val="center"/>
@@ -1344,6 +1392,9 @@
         </w:tc>
       </w:tr>
       <w:tr>
+        <w:trPr>
+          <w:cantSplit/>
+        </w:trPr>
         <w:tc>
           <w:tcPr>
             <w:tcW w:w="3009" w:type="dxa"/>
@@ -1392,6 +1443,9 @@
         </w:tc>
       </w:tr>
       <w:tr>
+        <w:trPr>
+          <w:cantSplit/>
+        </w:trPr>
         <w:tc>
           <w:tcPr>
             <w:tcW w:w="3009" w:type="dxa"/>
@@ -1463,6 +1517,9 @@
         </w:tc>
       </w:tr>
       <w:tr>
+        <w:trPr>
+          <w:cantSplit/>
+        </w:trPr>
         <w:tc>
           <w:tcPr>
             <w:tcW w:w="3009" w:type="dxa"/>
@@ -1537,6 +1594,7 @@
     <w:p>
       <w:pPr>
         <w:pStyle w:val="Heading1"/>
+        <w:keepNext/>
         <w:widowControl w:val="0"/>
         <w:spacing w:before="816" w:line="240" w:lineRule="auto"/>
         <w:ind w:right="407"/>
@@ -1578,6 +1636,10 @@
         <w:gridCol w:w="2235"/>
       </w:tblGrid>
       <w:tr>
+        <w:trPr>
+          <w:cantSplit/>
+          <w:tblHeader/>
+        </w:trPr>
         <w:tc>
           <w:tcPr>
             <w:tcW w:w="810" w:type="dxa"/>
@@ -1590,6 +1652,7 @@
           </w:tcPr>
           <w:p>
             <w:pPr>
+              <w:keepNext/>
               <w:widowControl w:val="0"/>
               <w:pBdr>
                 <w:top w:val="nil"/>
@@ -1630,6 +1693,7 @@
           </w:tcPr>
           <w:p>
             <w:pPr>
+              <w:keepNext/>
               <w:widowControl w:val="0"/>
               <w:spacing w:line="240" w:lineRule="auto"/>
               <w:jc w:val="center"/>
@@ -1663,6 +1727,7 @@
           </w:tcPr>
           <w:p>
             <w:pPr>
+              <w:keepNext/>
               <w:widowControl w:val="0"/>
               <w:pBdr>
                 <w:top w:val="nil"/>
@@ -1703,6 +1768,7 @@
           </w:tcPr>
           <w:p>
             <w:pPr>
+              <w:keepNext/>
               <w:widowControl w:val="0"/>
               <w:pBdr>
                 <w:top w:val="nil"/>
@@ -1733,6 +1799,9 @@
         </w:tc>
       </w:tr>
       <w:tr>
+        <w:trPr>
+          <w:cantSplit/>
+        </w:trPr>
         <w:tc>
           <w:tcPr>
             <w:tcW w:w="810" w:type="dxa"/>
@@ -1835,6 +1904,9 @@
         </w:tc>
       </w:tr>
       <w:tr>
+        <w:trPr>
+          <w:cantSplit/>
+        </w:trPr>
         <w:tc>
           <w:tcPr>
             <w:tcW w:w="810" w:type="dxa"/>
@@ -1937,6 +2009,9 @@
         </w:tc>
       </w:tr>
       <w:tr>
+        <w:trPr>
+          <w:cantSplit/>
+        </w:trPr>
         <w:tc>
           <w:tcPr>
             <w:tcW w:w="810" w:type="dxa"/>
@@ -2362,7 +2437,7 @@
           <w:sz w:val="24"/>
           <w:szCs w:val="24"/>
         </w:rPr>
-        <w:t xml:space="preserve">Form ini dipakai Project Manager untuk melaporkan progres proyek kepada pelanggan dan Direktur (COO), mingguan atau sesuai rencana komunikasi proyek, sesuai SNX-OPS-SOP-01 Bagian 6.4. Laporan memuat status, progres milestone, pekerjaan periode ini dan periode berikutnya, risiko dan isu, change request, serta keputusan yang dibutuhkan.</w:t>
+        <w:t xml:space="preserve">Form ini dipakai Project Manager untuk melaporkan progres proyek kepada pelanggan dan Direktur (COO), mingguan atau sesuai rencana komunikasi proyek (SNX-OPS-SOP-01 Bagian 6.4). Isinya status, progres milestone, pekerjaan periode ini dan berikutnya, risiko dan isu, change request, serta keputusan yang dibutuhkan.</w:t>
       </w:r>
     </w:p>
     <w:p>
@@ -2399,7 +2474,7 @@
           <w:sz w:val="24"/>
           <w:szCs w:val="24"/>
         </w:rPr>
-        <w:t xml:space="preserve">Form ini dipakai untuk proyek yang rencananya tercatat di SNX-OPS-FRM-01. Project Manager hanya merangkum data rencana, risiko, dan change request ke dalam laporan ini. Pencatatan rincinya tetap di SNX-OPS-FRM-01, SNX-OPS-FRM-02, dan SNX-OPS-FRM-04.</w:t>
+        <w:t xml:space="preserve">Form ini dipakai untuk proyek yang rencananya tercatat di SNX-OPS-FRM-01. Laporan ini hanya merangkum rencana, risiko, dan change request; rinciannya tetap dicatat di SNX-OPS-FRM-01, SNX-OPS-FRM-02, dan SNX-OPS-FRM-04.</w:t>
       </w:r>
     </w:p>
     <w:p>
@@ -2429,6 +2504,7 @@
     <w:p>
       <w:pPr>
         <w:pStyle w:val="Heading1"/>
+        <w:keepNext/>
         <w:numPr>
           <w:ilvl w:val="0"/>
           <w:numId w:val="7"/>
@@ -2454,6 +2530,8 @@
       </w:tblGrid>
       <w:tr>
         <w:trPr>
+          <w:cantSplit/>
+          <w:tblHeader/>
           <w:jc w:val="center"/>
         </w:trPr>
         <w:tc>
@@ -2469,6 +2547,7 @@
           </w:tcPr>
           <w:p>
             <w:pPr>
+              <w:keepNext/>
               <w:jc w:val="center"/>
               <w:rPr>
                 <w:sz w:val="24"/>
@@ -2499,6 +2578,7 @@
           </w:tcPr>
           <w:p>
             <w:pPr>
+              <w:keepNext/>
               <w:jc w:val="center"/>
               <w:rPr>
                 <w:sz w:val="24"/>
@@ -2519,6 +2599,7 @@
       </w:tr>
       <w:tr>
         <w:trPr>
+          <w:cantSplit/>
           <w:jc w:val="center"/>
         </w:trPr>
         <w:tc>
@@ -2573,13 +2654,14 @@
                 <w:sz w:val="24"/>
                 <w:szCs w:val="24"/>
               </w:rPr>
-              <w:t>Rencana proyek di SNX-OPS-FRM-01 yang menjadi pembanding status jadwal dan scope pada laporan.</w:t>
+              <w:t>Rencana proyek di SNX-OPS-FRM-01 yang menjadi pembanding status jadwal dan scope.</w:t>
             </w:r>
           </w:p>
         </w:tc>
       </w:tr>
       <w:tr>
         <w:trPr>
+          <w:cantSplit/>
           <w:jc w:val="center"/>
         </w:trPr>
         <w:tc>
@@ -2634,13 +2716,14 @@
                 <w:sz w:val="24"/>
                 <w:szCs w:val="24"/>
               </w:rPr>
-              <w:t>Titik capaian proyek yang dicatat di SNX-OPS-FRM-01 beserta tanggal rencana selesainya.</w:t>
+              <w:t>Titik capaian proyek beserta tanggal rencana selesainya, dicatat di SNX-OPS-FRM-01.</w:t>
             </w:r>
           </w:p>
         </w:tc>
       </w:tr>
       <w:tr>
         <w:trPr>
+          <w:cantSplit/>
           <w:jc w:val="center"/>
         </w:trPr>
         <w:tc>
@@ -2695,13 +2778,14 @@
                 <w:sz w:val="24"/>
                 <w:szCs w:val="24"/>
               </w:rPr>
-              <w:t>Permintaan perubahan scope, jadwal, atau biaya proyek. Dicatat di SNX-OPS-FRM-04 dan dikelola menurut SNX-OPS-SOP-02.</w:t>
+              <w:t>Permintaan perubahan scope, jadwal, atau biaya proyek, dicatat di SNX-OPS-FRM-04 dan dikelola sesuai SNX-OPS-SOP-02.</w:t>
             </w:r>
           </w:p>
         </w:tc>
       </w:tr>
       <w:tr>
         <w:trPr>
+          <w:cantSplit/>
           <w:jc w:val="center"/>
         </w:trPr>
         <w:tc>
@@ -2756,13 +2840,14 @@
                 <w:sz w:val="24"/>
                 <w:szCs w:val="24"/>
               </w:rPr>
-              <w:t>Syarat sebelum pekerjaan di environment production pelanggan dijalankan: approval, backup, dan rollback sudah lengkap.</w:t>
+              <w:t>Syarat sebelum pekerjaan di environment production pelanggan dimulai: approval, backup, dan rollback lengkap.</w:t>
             </w:r>
           </w:p>
         </w:tc>
       </w:tr>
       <w:tr>
         <w:trPr>
+          <w:cantSplit/>
           <w:jc w:val="center"/>
         </w:trPr>
         <w:tc>
@@ -2817,13 +2902,14 @@
                 <w:sz w:val="24"/>
                 <w:szCs w:val="24"/>
               </w:rPr>
-              <w:t>Kanal resmi, frekuensi laporan, dan matriks eskalasi pelanggan yang disusun saat perencanaan proyek (SNX-OPS-SOP-01 Bagian 6.2 butir 3).</w:t>
+              <w:t>Kanal resmi, frekuensi laporan, dan matriks eskalasi pelanggan, disusun saat perencanaan proyek (SNX-OPS-SOP-01 Bagian 6.2 butir 3).</w:t>
             </w:r>
           </w:p>
         </w:tc>
       </w:tr>
       <w:tr>
         <w:trPr>
+          <w:cantSplit/>
           <w:jc w:val="center"/>
         </w:trPr>
         <w:tc>
@@ -2885,6 +2971,7 @@
       </w:tr>
       <w:tr>
         <w:trPr>
+          <w:cantSplit/>
           <w:jc w:val="center"/>
         </w:trPr>
         <w:tc>
@@ -2939,13 +3026,14 @@
                 <w:sz w:val="24"/>
                 <w:szCs w:val="24"/>
               </w:rPr>
-              <w:t>Deviasi bisa dipulihkan tanpa mengubah baseline.</w:t>
+              <w:t>Deviasi masih bisa dipulihkan tanpa mengubah baseline.</w:t>
             </w:r>
           </w:p>
         </w:tc>
       </w:tr>
       <w:tr>
         <w:trPr>
+          <w:cantSplit/>
           <w:jc w:val="center"/>
         </w:trPr>
         <w:tc>
@@ -3033,6 +3121,7 @@
     <w:p>
       <w:pPr>
         <w:pStyle w:val="Heading1"/>
+        <w:keepNext/>
         <w:numPr>
           <w:ilvl w:val="0"/>
           <w:numId w:val="7"/>
@@ -3058,6 +3147,8 @@
       </w:tblGrid>
       <w:tr>
         <w:trPr>
+          <w:cantSplit/>
+          <w:tblHeader/>
           <w:jc w:val="center"/>
         </w:trPr>
         <w:tc>
@@ -3073,6 +3164,7 @@
           </w:tcPr>
           <w:p>
             <w:pPr>
+              <w:keepNext/>
               <w:jc w:val="center"/>
               <w:rPr>
                 <w:sz w:val="24"/>
@@ -3103,6 +3195,7 @@
           </w:tcPr>
           <w:p>
             <w:pPr>
+              <w:keepNext/>
               <w:jc w:val="center"/>
               <w:rPr>
                 <w:sz w:val="24"/>
@@ -3123,6 +3216,7 @@
       </w:tr>
       <w:tr>
         <w:trPr>
+          <w:cantSplit/>
           <w:jc w:val="center"/>
         </w:trPr>
         <w:tc>
@@ -3177,13 +3271,14 @@
                 <w:sz w:val="24"/>
                 <w:szCs w:val="24"/>
               </w:rPr>
-              <w:t>Pemilik dokumen. Menyusun dan mengirim laporan ke pelanggan dan COO, mengeskalasi status Merah, dan menyimpan PDF di folder proyek.</w:t>
+              <w:t>Pemilik dokumen. Menyusun dan mengirim laporan ke pelanggan dan COO, mengeskalasi status Merah, serta menyimpan PDF di folder proyek.</w:t>
             </w:r>
           </w:p>
         </w:tc>
       </w:tr>
       <w:tr>
         <w:trPr>
+          <w:cantSplit/>
           <w:jc w:val="center"/>
         </w:trPr>
         <w:tc>
@@ -3238,13 +3333,14 @@
                 <w:sz w:val="24"/>
                 <w:szCs w:val="24"/>
               </w:rPr>
-              <w:t>Memeriksa konsistensi dan kelengkapan laporan sebelum dikirim. Penerima laporan.</w:t>
+              <w:t>Memeriksa konsistensi dan kelengkapan laporan sebelum dikirim; juga menerima laporan.</w:t>
             </w:r>
           </w:p>
         </w:tc>
       </w:tr>
       <w:tr>
         <w:trPr>
+          <w:cantSplit/>
           <w:jc w:val="center"/>
         </w:trPr>
         <w:tc>
@@ -3299,13 +3395,14 @@
                 <w:sz w:val="24"/>
                 <w:szCs w:val="24"/>
               </w:rPr>
-              <w:t>Menerima eskalasi bila ada status Merah.</w:t>
+              <w:t>Menerima eskalasi jika ada status Merah.</w:t>
             </w:r>
           </w:p>
         </w:tc>
       </w:tr>
       <w:tr>
         <w:trPr>
+          <w:cantSplit/>
           <w:jc w:val="center"/>
         </w:trPr>
         <w:tc>
@@ -3360,13 +3457,14 @@
                 <w:sz w:val="24"/>
                 <w:szCs w:val="24"/>
               </w:rPr>
-              <w:t>Menerima laporan dan eskalasi status Merah. Memutuskan hal berstatus Merah yang butuh keputusan COO.</w:t>
+              <w:t>Menerima laporan dan eskalasi status Merah, lalu memutuskan hal berstatus Merah yang butuh keputusan COO.</w:t>
             </w:r>
           </w:p>
         </w:tc>
       </w:tr>
       <w:tr>
         <w:trPr>
+          <w:cantSplit/>
           <w:jc w:val="center"/>
         </w:trPr>
         <w:tc>
@@ -3421,7 +3519,7 @@
                 <w:sz w:val="24"/>
                 <w:szCs w:val="24"/>
               </w:rPr>
-              <w:t>Menerima laporan. Memutuskan hal berstatus Merah yang butuh keputusan pelanggan. Paraf Diterima bersifat opsional.</w:t>
+              <w:t>Menerima laporan dan memutuskan hal berstatus Merah yang butuh keputusan pelanggan. Paraf Diterima bersifat opsional.</w:t>
             </w:r>
           </w:p>
         </w:tc>
@@ -3472,7 +3570,7 @@
           <w:sz w:val="24"/>
           <w:szCs w:val="24"/>
         </w:rPr>
-        <w:t xml:space="preserve">Peran di tabel ini berlaku untuk laporan yang diisi. Penyusun, pemeriksa, dan penyetuju dokumen form ini ada di blok Approval pada halaman depan.</w:t>
+        <w:t xml:space="preserve">Peran di tabel ini berlaku untuk laporan yang diisi. Penyusun, pemeriksa, dan penyetuju form ini tercantum di blok Approval halaman depan.</w:t>
       </w:r>
     </w:p>
     <w:p>
@@ -3509,7 +3607,7 @@
           <w:sz w:val="24"/>
           <w:szCs w:val="24"/>
         </w:rPr>
-        <w:t xml:space="preserve">1. Teks dalam kurung siku adalah petunjuk. Project Manager menghapusnya saat mengisi.</w:t>
+        <w:t xml:space="preserve">1. Teks dalam kurung siku adalah petunjuk; hapus saat mengisi.</w:t>
       </w:r>
     </w:p>
     <w:p>
@@ -3533,7 +3631,7 @@
           <w:sz w:val="24"/>
           <w:szCs w:val="24"/>
         </w:rPr>
-        <w:t xml:space="preserve">2. Project Manager menambah baris tabel bila isi laporan melebihi baris yang tersedia.</w:t>
+        <w:t xml:space="preserve">2. Tambah baris tabel jika isi laporan melebihi baris yang tersedia.</w:t>
       </w:r>
     </w:p>
     <w:p>
@@ -3557,7 +3655,7 @@
           <w:sz w:val="24"/>
           <w:szCs w:val="24"/>
         </w:rPr>
-        <w:t xml:space="preserve">3. Project Manager menyimpan laporan sebagai PDF dengan nama FRM-03_&lt;KodeProyek&gt;_&lt;YYYY-MM-DD&gt;.pdf di folder proyek.</w:t>
+        <w:t xml:space="preserve">3. Simpan laporan sebagai PDF dengan nama FRM-03_&lt;KodeProyek&gt;_&lt;YYYY-MM-DD&gt;.pdf di folder proyek.</w:t>
       </w:r>
     </w:p>
     <w:p>
@@ -3599,7 +3697,7 @@
       <w:r>
         <w:drawing>
           <wp:inline xmlns:a="http://schemas.openxmlformats.org/drawingml/2006/main" xmlns:pic="http://schemas.openxmlformats.org/drawingml/2006/picture">
-            <wp:extent cx="3973148" cy="6840000"/>
+            <wp:extent cx="5580000" cy="6165087"/>
             <wp:docPr id="1" name="Picture 1"/>
             <wp:cNvGraphicFramePr>
               <a:graphicFrameLocks noChangeAspect="1"/>
@@ -3620,7 +3718,7 @@
                   <pic:spPr>
                     <a:xfrm>
                       <a:off x="0" y="0"/>
-                      <a:ext cx="3973148" cy="6840000"/>
+                      <a:ext cx="5580000" cy="6165087"/>
                     </a:xfrm>
                     <a:prstGeom prst="rect"/>
                   </pic:spPr>
@@ -3652,7 +3750,7 @@
           <w:sz w:val="24"/>
           <w:szCs w:val="24"/>
         </w:rPr>
-        <w:t xml:space="preserve">Gambar 1. Alur pengisian Project Progress &amp; Monitoring Report. Eskalasi hanya berlaku bila ada status Merah; sesudahnya laporan tetap melalui review Service Delivery Manager.</w:t>
+        <w:t xml:space="preserve">Gambar 1. Alur pengisian Project Progress &amp; Monitoring Report. Eskalasi hanya untuk status Merah; setelah itu laporan tetap di-review Service Delivery Manager.</w:t>
       </w:r>
     </w:p>
     <w:p>
@@ -3671,6 +3769,7 @@
     <w:p>
       <w:pPr>
         <w:pStyle w:val="Heading2"/>
+        <w:keepNext/>
         <w:numPr>
           <w:ilvl w:val="1"/>
           <w:numId w:val="7"/>
@@ -3696,6 +3795,8 @@
       </w:tblGrid>
       <w:tr>
         <w:trPr>
+          <w:cantSplit/>
+          <w:tblHeader/>
           <w:jc w:val="center"/>
         </w:trPr>
         <w:tc>
@@ -3711,6 +3812,7 @@
           </w:tcPr>
           <w:p>
             <w:pPr>
+              <w:keepNext/>
               <w:jc w:val="center"/>
               <w:rPr>
                 <w:sz w:val="24"/>
@@ -3741,6 +3843,7 @@
           </w:tcPr>
           <w:p>
             <w:pPr>
+              <w:keepNext/>
               <w:jc w:val="center"/>
               <w:rPr>
                 <w:sz w:val="24"/>
@@ -3761,6 +3864,7 @@
       </w:tr>
       <w:tr>
         <w:trPr>
+          <w:cantSplit/>
           <w:jc w:val="center"/>
         </w:trPr>
         <w:tc>
@@ -3822,6 +3926,7 @@
       </w:tr>
       <w:tr>
         <w:trPr>
+          <w:cantSplit/>
           <w:jc w:val="center"/>
         </w:trPr>
         <w:tc>
@@ -3883,6 +3988,7 @@
       </w:tr>
       <w:tr>
         <w:trPr>
+          <w:cantSplit/>
           <w:jc w:val="center"/>
         </w:trPr>
         <w:tc>
@@ -3944,6 +4050,7 @@
       </w:tr>
       <w:tr>
         <w:trPr>
+          <w:cantSplit/>
           <w:jc w:val="center"/>
         </w:trPr>
         <w:tc>
@@ -4005,6 +4112,7 @@
       </w:tr>
       <w:tr>
         <w:trPr>
+          <w:cantSplit/>
           <w:jc w:val="center"/>
         </w:trPr>
         <w:tc>
@@ -4066,6 +4174,7 @@
       </w:tr>
       <w:tr>
         <w:trPr>
+          <w:cantSplit/>
           <w:jc w:val="center"/>
         </w:trPr>
         <w:tc>
@@ -4127,6 +4236,7 @@
       </w:tr>
       <w:tr>
         <w:trPr>
+          <w:cantSplit/>
           <w:jc w:val="center"/>
         </w:trPr>
         <w:tc>
@@ -4188,6 +4298,7 @@
       </w:tr>
       <w:tr>
         <w:trPr>
+          <w:cantSplit/>
           <w:jc w:val="center"/>
         </w:trPr>
         <w:tc>
@@ -4306,11 +4417,12 @@
           <w:sz w:val="24"/>
           <w:szCs w:val="24"/>
         </w:rPr>
-        <w:t xml:space="preserve">Project Manager menulis salah satu dari Hijau, Kuning, atau Merah di kolom Status. Arti tiap warna ada di bagian Istilah.</w:t>
+        <w:t xml:space="preserve">Isi kolom Status dengan Hijau, Kuning, atau Merah sesuai arti di tabel Istilah.</w:t>
       </w:r>
     </w:p>
     <w:p>
       <w:pPr>
+        <w:keepNext/>
         <w:pBdr>
           <w:top w:val="nil"/>
           <w:left w:val="nil"/>
@@ -4330,7 +4442,7 @@
           <w:sz w:val="24"/>
           <w:szCs w:val="24"/>
         </w:rPr>
-        <w:t xml:space="preserve">Untuk dimensi Jadwal, deviasi lebih dari 1 minggu dari baseline diberi status Merah (USULAN). Ambang ini sama dengan ambang eskalasi ke COO di SNX-OPS-SOP-01 Bagian 6.4.</w:t>
+        <w:t xml:space="preserve">Untuk dimensi Jadwal, deviasi lebih dari 1 minggu dari baseline diberi status Merah, sama dengan ambang eskalasi ke COO di SNX-OPS-SOP-01 Bagian 6.4 (USULAN).</w:t>
       </w:r>
     </w:p>
     <w:tbl>
@@ -4349,6 +4461,8 @@
       </w:tblGrid>
       <w:tr>
         <w:trPr>
+          <w:cantSplit/>
+          <w:tblHeader/>
           <w:jc w:val="center"/>
         </w:trPr>
         <w:tc>
@@ -4364,6 +4478,7 @@
           </w:tcPr>
           <w:p>
             <w:pPr>
+              <w:keepNext/>
               <w:jc w:val="center"/>
               <w:rPr>
                 <w:sz w:val="24"/>
@@ -4394,6 +4509,7 @@
           </w:tcPr>
           <w:p>
             <w:pPr>
+              <w:keepNext/>
               <w:jc w:val="center"/>
               <w:rPr>
                 <w:sz w:val="24"/>
@@ -4424,6 +4540,7 @@
           </w:tcPr>
           <w:p>
             <w:pPr>
+              <w:keepNext/>
               <w:jc w:val="center"/>
               <w:rPr>
                 <w:sz w:val="24"/>
@@ -4444,6 +4561,7 @@
       </w:tr>
       <w:tr>
         <w:trPr>
+          <w:cantSplit/>
           <w:jc w:val="center"/>
         </w:trPr>
         <w:tc>
@@ -4514,7 +4632,7 @@
           </w:tcPr>
           <w:p>
             <w:pPr>
-              <w:jc w:val="both"/>
+              <w:jc w:val="left"/>
               <w:rPr>
                 <w:sz w:val="24"/>
                 <w:szCs w:val="24"/>
@@ -4532,6 +4650,7 @@
       </w:tr>
       <w:tr>
         <w:trPr>
+          <w:cantSplit/>
           <w:jc w:val="center"/>
         </w:trPr>
         <w:tc>
@@ -4602,7 +4721,7 @@
           </w:tcPr>
           <w:p>
             <w:pPr>
-              <w:jc w:val="both"/>
+              <w:jc w:val="left"/>
               <w:rPr>
                 <w:sz w:val="24"/>
                 <w:szCs w:val="24"/>
@@ -4621,6 +4740,7 @@
       </w:tr>
       <w:tr>
         <w:trPr>
+          <w:cantSplit/>
           <w:jc w:val="center"/>
         </w:trPr>
         <w:tc>
@@ -4691,7 +4811,7 @@
           </w:tcPr>
           <w:p>
             <w:pPr>
-              <w:jc w:val="both"/>
+              <w:jc w:val="left"/>
               <w:rPr>
                 <w:sz w:val="24"/>
                 <w:szCs w:val="24"/>
@@ -4710,6 +4830,7 @@
       </w:tr>
       <w:tr>
         <w:trPr>
+          <w:cantSplit/>
           <w:jc w:val="center"/>
         </w:trPr>
         <w:tc>
@@ -4780,7 +4901,7 @@
           </w:tcPr>
           <w:p>
             <w:pPr>
-              <w:jc w:val="both"/>
+              <w:jc w:val="left"/>
               <w:rPr>
                 <w:sz w:val="24"/>
                 <w:szCs w:val="24"/>
@@ -4799,6 +4920,7 @@
       </w:tr>
       <w:tr>
         <w:trPr>
+          <w:cantSplit/>
           <w:jc w:val="center"/>
         </w:trPr>
         <w:tc>
@@ -4869,7 +4991,7 @@
           </w:tcPr>
           <w:p>
             <w:pPr>
-              <w:jc w:val="both"/>
+              <w:jc w:val="left"/>
               <w:rPr>
                 <w:sz w:val="24"/>
                 <w:szCs w:val="24"/>
@@ -4888,6 +5010,7 @@
       </w:tr>
       <w:tr>
         <w:trPr>
+          <w:cantSplit/>
           <w:jc w:val="center"/>
         </w:trPr>
         <w:tc>
@@ -4958,7 +5081,7 @@
           </w:tcPr>
           <w:p>
             <w:pPr>
-              <w:jc w:val="both"/>
+              <w:jc w:val="left"/>
               <w:rPr>
                 <w:sz w:val="24"/>
                 <w:szCs w:val="24"/>
@@ -5015,6 +5138,7 @@
     </w:p>
     <w:p>
       <w:pPr>
+        <w:keepNext/>
         <w:pBdr>
           <w:top w:val="nil"/>
           <w:left w:val="nil"/>
@@ -5056,6 +5180,8 @@
       </w:tblGrid>
       <w:tr>
         <w:trPr>
+          <w:cantSplit/>
+          <w:tblHeader/>
           <w:jc w:val="center"/>
         </w:trPr>
         <w:tc>
@@ -5071,6 +5197,7 @@
           </w:tcPr>
           <w:p>
             <w:pPr>
+              <w:keepNext/>
               <w:jc w:val="center"/>
               <w:rPr>
                 <w:sz w:val="24"/>
@@ -5101,6 +5228,7 @@
           </w:tcPr>
           <w:p>
             <w:pPr>
+              <w:keepNext/>
               <w:jc w:val="center"/>
               <w:rPr>
                 <w:sz w:val="24"/>
@@ -5131,6 +5259,7 @@
           </w:tcPr>
           <w:p>
             <w:pPr>
+              <w:keepNext/>
               <w:jc w:val="center"/>
               <w:rPr>
                 <w:sz w:val="24"/>
@@ -5161,6 +5290,7 @@
           </w:tcPr>
           <w:p>
             <w:pPr>
+              <w:keepNext/>
               <w:jc w:val="center"/>
               <w:rPr>
                 <w:sz w:val="24"/>
@@ -5191,6 +5321,7 @@
           </w:tcPr>
           <w:p>
             <w:pPr>
+              <w:keepNext/>
               <w:jc w:val="center"/>
               <w:rPr>
                 <w:sz w:val="24"/>
@@ -5221,6 +5352,7 @@
           </w:tcPr>
           <w:p>
             <w:pPr>
+              <w:keepNext/>
               <w:jc w:val="center"/>
               <w:rPr>
                 <w:sz w:val="24"/>
@@ -5241,7 +5373,9 @@
       </w:tr>
       <w:tr>
         <w:trPr>
+          <w:cantSplit/>
           <w:jc w:val="center"/>
+          <w:trHeight w:val="510" w:hRule="atLeast"/>
         </w:trPr>
         <w:tc>
           <w:tcPr>
@@ -5311,7 +5445,7 @@
           </w:tcPr>
           <w:p>
             <w:pPr>
-              <w:jc w:val="both"/>
+              <w:jc w:val="left"/>
               <w:rPr>
                 <w:sz w:val="24"/>
                 <w:szCs w:val="24"/>
@@ -5339,7 +5473,7 @@
           </w:tcPr>
           <w:p>
             <w:pPr>
-              <w:jc w:val="both"/>
+              <w:jc w:val="left"/>
               <w:rPr>
                 <w:sz w:val="24"/>
                 <w:szCs w:val="24"/>
@@ -5367,7 +5501,7 @@
           </w:tcPr>
           <w:p>
             <w:pPr>
-              <w:jc w:val="both"/>
+              <w:jc w:val="left"/>
               <w:rPr>
                 <w:sz w:val="24"/>
                 <w:szCs w:val="24"/>
@@ -5395,7 +5529,7 @@
           </w:tcPr>
           <w:p>
             <w:pPr>
-              <w:jc w:val="both"/>
+              <w:jc w:val="left"/>
               <w:rPr>
                 <w:sz w:val="24"/>
                 <w:szCs w:val="24"/>
@@ -5413,7 +5547,9 @@
       </w:tr>
       <w:tr>
         <w:trPr>
+          <w:cantSplit/>
           <w:jc w:val="center"/>
+          <w:trHeight w:val="510" w:hRule="atLeast"/>
         </w:trPr>
         <w:tc>
           <w:tcPr>
@@ -5483,7 +5619,7 @@
           </w:tcPr>
           <w:p>
             <w:pPr>
-              <w:jc w:val="both"/>
+              <w:jc w:val="left"/>
               <w:rPr>
                 <w:sz w:val="24"/>
                 <w:szCs w:val="24"/>
@@ -5511,7 +5647,7 @@
           </w:tcPr>
           <w:p>
             <w:pPr>
-              <w:jc w:val="both"/>
+              <w:jc w:val="left"/>
               <w:rPr>
                 <w:sz w:val="24"/>
                 <w:szCs w:val="24"/>
@@ -5539,7 +5675,7 @@
           </w:tcPr>
           <w:p>
             <w:pPr>
-              <w:jc w:val="both"/>
+              <w:jc w:val="left"/>
               <w:rPr>
                 <w:sz w:val="24"/>
                 <w:szCs w:val="24"/>
@@ -5567,7 +5703,7 @@
           </w:tcPr>
           <w:p>
             <w:pPr>
-              <w:jc w:val="both"/>
+              <w:jc w:val="left"/>
               <w:rPr>
                 <w:sz w:val="24"/>
                 <w:szCs w:val="24"/>
@@ -5585,7 +5721,9 @@
       </w:tr>
       <w:tr>
         <w:trPr>
+          <w:cantSplit/>
           <w:jc w:val="center"/>
+          <w:trHeight w:val="510" w:hRule="atLeast"/>
         </w:trPr>
         <w:tc>
           <w:tcPr>
@@ -5655,7 +5793,7 @@
           </w:tcPr>
           <w:p>
             <w:pPr>
-              <w:jc w:val="both"/>
+              <w:jc w:val="left"/>
               <w:rPr>
                 <w:sz w:val="24"/>
                 <w:szCs w:val="24"/>
@@ -5683,7 +5821,7 @@
           </w:tcPr>
           <w:p>
             <w:pPr>
-              <w:jc w:val="both"/>
+              <w:jc w:val="left"/>
               <w:rPr>
                 <w:sz w:val="24"/>
                 <w:szCs w:val="24"/>
@@ -5711,7 +5849,7 @@
           </w:tcPr>
           <w:p>
             <w:pPr>
-              <w:jc w:val="both"/>
+              <w:jc w:val="left"/>
               <w:rPr>
                 <w:sz w:val="24"/>
                 <w:szCs w:val="24"/>
@@ -5739,7 +5877,7 @@
           </w:tcPr>
           <w:p>
             <w:pPr>
-              <w:jc w:val="both"/>
+              <w:jc w:val="left"/>
               <w:rPr>
                 <w:sz w:val="24"/>
                 <w:szCs w:val="24"/>
@@ -5757,7 +5895,9 @@
       </w:tr>
       <w:tr>
         <w:trPr>
+          <w:cantSplit/>
           <w:jc w:val="center"/>
+          <w:trHeight w:val="510" w:hRule="atLeast"/>
         </w:trPr>
         <w:tc>
           <w:tcPr>
@@ -5827,7 +5967,7 @@
           </w:tcPr>
           <w:p>
             <w:pPr>
-              <w:jc w:val="both"/>
+              <w:jc w:val="left"/>
               <w:rPr>
                 <w:sz w:val="24"/>
                 <w:szCs w:val="24"/>
@@ -5855,7 +5995,7 @@
           </w:tcPr>
           <w:p>
             <w:pPr>
-              <w:jc w:val="both"/>
+              <w:jc w:val="left"/>
               <w:rPr>
                 <w:sz w:val="24"/>
                 <w:szCs w:val="24"/>
@@ -5883,7 +6023,7 @@
           </w:tcPr>
           <w:p>
             <w:pPr>
-              <w:jc w:val="both"/>
+              <w:jc w:val="left"/>
               <w:rPr>
                 <w:sz w:val="24"/>
                 <w:szCs w:val="24"/>
@@ -5911,7 +6051,7 @@
           </w:tcPr>
           <w:p>
             <w:pPr>
-              <w:jc w:val="both"/>
+              <w:jc w:val="left"/>
               <w:rPr>
                 <w:sz w:val="24"/>
                 <w:szCs w:val="24"/>
@@ -5979,6 +6119,7 @@
     <w:p>
       <w:pPr>
         <w:pStyle w:val="Heading2"/>
+        <w:keepNext/>
         <w:numPr>
           <w:ilvl w:val="1"/>
           <w:numId w:val="7"/>
@@ -6005,6 +6146,8 @@
       </w:tblGrid>
       <w:tr>
         <w:trPr>
+          <w:cantSplit/>
+          <w:tblHeader/>
           <w:jc w:val="center"/>
         </w:trPr>
         <w:tc>
@@ -6020,6 +6163,7 @@
           </w:tcPr>
           <w:p>
             <w:pPr>
+              <w:keepNext/>
               <w:jc w:val="center"/>
               <w:rPr>
                 <w:sz w:val="24"/>
@@ -6050,6 +6194,7 @@
           </w:tcPr>
           <w:p>
             <w:pPr>
+              <w:keepNext/>
               <w:jc w:val="center"/>
               <w:rPr>
                 <w:sz w:val="24"/>
@@ -6080,6 +6225,7 @@
           </w:tcPr>
           <w:p>
             <w:pPr>
+              <w:keepNext/>
               <w:jc w:val="center"/>
               <w:rPr>
                 <w:sz w:val="24"/>
@@ -6093,14 +6239,16 @@
                 <w:sz w:val="24"/>
                 <w:szCs w:val="24"/>
               </w:rPr>
-              <w:t>Bukti atau referensi (CR, tiket Zammad, dokumen)</w:t>
+              <w:t>Bukti atau referensi (CR, ticket Zammad, dokumen)</w:t>
             </w:r>
           </w:p>
         </w:tc>
       </w:tr>
       <w:tr>
         <w:trPr>
+          <w:cantSplit/>
           <w:jc w:val="center"/>
+          <w:trHeight w:val="510" w:hRule="atLeast"/>
         </w:trPr>
         <w:tc>
           <w:tcPr>
@@ -6170,7 +6318,7 @@
           </w:tcPr>
           <w:p>
             <w:pPr>
-              <w:jc w:val="both"/>
+              <w:jc w:val="left"/>
               <w:rPr>
                 <w:sz w:val="24"/>
                 <w:szCs w:val="24"/>
@@ -6188,7 +6336,9 @@
       </w:tr>
       <w:tr>
         <w:trPr>
+          <w:cantSplit/>
           <w:jc w:val="center"/>
+          <w:trHeight w:val="510" w:hRule="atLeast"/>
         </w:trPr>
         <w:tc>
           <w:tcPr>
@@ -6258,7 +6408,7 @@
           </w:tcPr>
           <w:p>
             <w:pPr>
-              <w:jc w:val="both"/>
+              <w:jc w:val="left"/>
               <w:rPr>
                 <w:sz w:val="24"/>
                 <w:szCs w:val="24"/>
@@ -6276,7 +6426,9 @@
       </w:tr>
       <w:tr>
         <w:trPr>
+          <w:cantSplit/>
           <w:jc w:val="center"/>
+          <w:trHeight w:val="510" w:hRule="atLeast"/>
         </w:trPr>
         <w:tc>
           <w:tcPr>
@@ -6346,7 +6498,7 @@
           </w:tcPr>
           <w:p>
             <w:pPr>
-              <w:jc w:val="both"/>
+              <w:jc w:val="left"/>
               <w:rPr>
                 <w:sz w:val="24"/>
                 <w:szCs w:val="24"/>
@@ -6390,6 +6542,7 @@
     <w:p>
       <w:pPr>
         <w:pStyle w:val="Heading2"/>
+        <w:keepNext/>
         <w:numPr>
           <w:ilvl w:val="1"/>
           <w:numId w:val="7"/>
@@ -6417,6 +6570,8 @@
       </w:tblGrid>
       <w:tr>
         <w:trPr>
+          <w:cantSplit/>
+          <w:tblHeader/>
           <w:jc w:val="center"/>
         </w:trPr>
         <w:tc>
@@ -6432,6 +6587,7 @@
           </w:tcPr>
           <w:p>
             <w:pPr>
+              <w:keepNext/>
               <w:jc w:val="center"/>
               <w:rPr>
                 <w:sz w:val="24"/>
@@ -6462,6 +6618,7 @@
           </w:tcPr>
           <w:p>
             <w:pPr>
+              <w:keepNext/>
               <w:jc w:val="center"/>
               <w:rPr>
                 <w:sz w:val="24"/>
@@ -6492,6 +6649,7 @@
           </w:tcPr>
           <w:p>
             <w:pPr>
+              <w:keepNext/>
               <w:jc w:val="center"/>
               <w:rPr>
                 <w:sz w:val="24"/>
@@ -6522,6 +6680,7 @@
           </w:tcPr>
           <w:p>
             <w:pPr>
+              <w:keepNext/>
               <w:jc w:val="center"/>
               <w:rPr>
                 <w:sz w:val="24"/>
@@ -6542,7 +6701,9 @@
       </w:tr>
       <w:tr>
         <w:trPr>
+          <w:cantSplit/>
           <w:jc w:val="center"/>
+          <w:trHeight w:val="510" w:hRule="atLeast"/>
         </w:trPr>
         <w:tc>
           <w:tcPr>
@@ -6612,7 +6773,7 @@
           </w:tcPr>
           <w:p>
             <w:pPr>
-              <w:jc w:val="both"/>
+              <w:jc w:val="left"/>
               <w:rPr>
                 <w:sz w:val="24"/>
                 <w:szCs w:val="24"/>
@@ -6640,7 +6801,7 @@
           </w:tcPr>
           <w:p>
             <w:pPr>
-              <w:jc w:val="both"/>
+              <w:jc w:val="left"/>
               <w:rPr>
                 <w:sz w:val="24"/>
                 <w:szCs w:val="24"/>
@@ -6658,7 +6819,9 @@
       </w:tr>
       <w:tr>
         <w:trPr>
+          <w:cantSplit/>
           <w:jc w:val="center"/>
+          <w:trHeight w:val="510" w:hRule="atLeast"/>
         </w:trPr>
         <w:tc>
           <w:tcPr>
@@ -6728,7 +6891,7 @@
           </w:tcPr>
           <w:p>
             <w:pPr>
-              <w:jc w:val="both"/>
+              <w:jc w:val="left"/>
               <w:rPr>
                 <w:sz w:val="24"/>
                 <w:szCs w:val="24"/>
@@ -6756,7 +6919,7 @@
           </w:tcPr>
           <w:p>
             <w:pPr>
-              <w:jc w:val="both"/>
+              <w:jc w:val="left"/>
               <w:rPr>
                 <w:sz w:val="24"/>
                 <w:szCs w:val="24"/>
@@ -6774,7 +6937,9 @@
       </w:tr>
       <w:tr>
         <w:trPr>
+          <w:cantSplit/>
           <w:jc w:val="center"/>
+          <w:trHeight w:val="510" w:hRule="atLeast"/>
         </w:trPr>
         <w:tc>
           <w:tcPr>
@@ -6844,7 +7009,7 @@
           </w:tcPr>
           <w:p>
             <w:pPr>
-              <w:jc w:val="both"/>
+              <w:jc w:val="left"/>
               <w:rPr>
                 <w:sz w:val="24"/>
                 <w:szCs w:val="24"/>
@@ -6872,7 +7037,7 @@
           </w:tcPr>
           <w:p>
             <w:pPr>
-              <w:jc w:val="both"/>
+              <w:jc w:val="left"/>
               <w:rPr>
                 <w:sz w:val="24"/>
                 <w:szCs w:val="24"/>
@@ -6916,6 +7081,7 @@
     <w:p>
       <w:pPr>
         <w:pStyle w:val="Heading2"/>
+        <w:keepNext/>
         <w:numPr>
           <w:ilvl w:val="1"/>
           <w:numId w:val="7"/>
@@ -6945,6 +7111,8 @@
       </w:tblGrid>
       <w:tr>
         <w:trPr>
+          <w:cantSplit/>
+          <w:tblHeader/>
           <w:jc w:val="center"/>
         </w:trPr>
         <w:tc>
@@ -6960,6 +7128,7 @@
           </w:tcPr>
           <w:p>
             <w:pPr>
+              <w:keepNext/>
               <w:jc w:val="center"/>
               <w:rPr>
                 <w:sz w:val="24"/>
@@ -6990,6 +7159,7 @@
           </w:tcPr>
           <w:p>
             <w:pPr>
+              <w:keepNext/>
               <w:jc w:val="center"/>
               <w:rPr>
                 <w:sz w:val="24"/>
@@ -7020,6 +7190,7 @@
           </w:tcPr>
           <w:p>
             <w:pPr>
+              <w:keepNext/>
               <w:jc w:val="center"/>
               <w:rPr>
                 <w:sz w:val="24"/>
@@ -7050,6 +7221,7 @@
           </w:tcPr>
           <w:p>
             <w:pPr>
+              <w:keepNext/>
               <w:jc w:val="center"/>
               <w:rPr>
                 <w:sz w:val="24"/>
@@ -7080,6 +7252,7 @@
           </w:tcPr>
           <w:p>
             <w:pPr>
+              <w:keepNext/>
               <w:jc w:val="center"/>
               <w:rPr>
                 <w:sz w:val="24"/>
@@ -7110,6 +7283,7 @@
           </w:tcPr>
           <w:p>
             <w:pPr>
+              <w:keepNext/>
               <w:jc w:val="center"/>
               <w:rPr>
                 <w:sz w:val="24"/>
@@ -7130,7 +7304,9 @@
       </w:tr>
       <w:tr>
         <w:trPr>
+          <w:cantSplit/>
           <w:jc w:val="center"/>
+          <w:trHeight w:val="510" w:hRule="atLeast"/>
         </w:trPr>
         <w:tc>
           <w:tcPr>
@@ -7199,7 +7375,7 @@
           </w:tcPr>
           <w:p>
             <w:pPr>
-              <w:jc w:val="both"/>
+              <w:jc w:val="left"/>
               <w:rPr>
                 <w:sz w:val="24"/>
                 <w:szCs w:val="24"/>
@@ -7227,7 +7403,7 @@
           </w:tcPr>
           <w:p>
             <w:pPr>
-              <w:jc w:val="both"/>
+              <w:jc w:val="left"/>
               <w:rPr>
                 <w:sz w:val="24"/>
                 <w:szCs w:val="24"/>
@@ -7255,7 +7431,7 @@
           </w:tcPr>
           <w:p>
             <w:pPr>
-              <w:jc w:val="both"/>
+              <w:jc w:val="left"/>
               <w:rPr>
                 <w:sz w:val="24"/>
                 <w:szCs w:val="24"/>
@@ -7283,7 +7459,7 @@
           </w:tcPr>
           <w:p>
             <w:pPr>
-              <w:jc w:val="both"/>
+              <w:jc w:val="left"/>
               <w:rPr>
                 <w:sz w:val="24"/>
                 <w:szCs w:val="24"/>
@@ -7301,7 +7477,9 @@
       </w:tr>
       <w:tr>
         <w:trPr>
+          <w:cantSplit/>
           <w:jc w:val="center"/>
+          <w:trHeight w:val="510" w:hRule="atLeast"/>
         </w:trPr>
         <w:tc>
           <w:tcPr>
@@ -7370,7 +7548,7 @@
           </w:tcPr>
           <w:p>
             <w:pPr>
-              <w:jc w:val="both"/>
+              <w:jc w:val="left"/>
               <w:rPr>
                 <w:sz w:val="24"/>
                 <w:szCs w:val="24"/>
@@ -7398,7 +7576,7 @@
           </w:tcPr>
           <w:p>
             <w:pPr>
-              <w:jc w:val="both"/>
+              <w:jc w:val="left"/>
               <w:rPr>
                 <w:sz w:val="24"/>
                 <w:szCs w:val="24"/>
@@ -7426,7 +7604,7 @@
           </w:tcPr>
           <w:p>
             <w:pPr>
-              <w:jc w:val="both"/>
+              <w:jc w:val="left"/>
               <w:rPr>
                 <w:sz w:val="24"/>
                 <w:szCs w:val="24"/>
@@ -7454,7 +7632,7 @@
           </w:tcPr>
           <w:p>
             <w:pPr>
-              <w:jc w:val="both"/>
+              <w:jc w:val="left"/>
               <w:rPr>
                 <w:sz w:val="24"/>
                 <w:szCs w:val="24"/>
@@ -7498,6 +7676,7 @@
     <w:p>
       <w:pPr>
         <w:pStyle w:val="Heading2"/>
+        <w:keepNext/>
         <w:numPr>
           <w:ilvl w:val="1"/>
           <w:numId w:val="7"/>
@@ -7526,6 +7705,8 @@
       </w:tblGrid>
       <w:tr>
         <w:trPr>
+          <w:cantSplit/>
+          <w:tblHeader/>
           <w:jc w:val="center"/>
         </w:trPr>
         <w:tc>
@@ -7541,6 +7722,7 @@
           </w:tcPr>
           <w:p>
             <w:pPr>
+              <w:keepNext/>
               <w:jc w:val="center"/>
               <w:rPr>
                 <w:sz w:val="24"/>
@@ -7571,6 +7753,7 @@
           </w:tcPr>
           <w:p>
             <w:pPr>
+              <w:keepNext/>
               <w:jc w:val="center"/>
               <w:rPr>
                 <w:sz w:val="24"/>
@@ -7601,6 +7784,7 @@
           </w:tcPr>
           <w:p>
             <w:pPr>
+              <w:keepNext/>
               <w:jc w:val="center"/>
               <w:rPr>
                 <w:sz w:val="24"/>
@@ -7631,6 +7815,7 @@
           </w:tcPr>
           <w:p>
             <w:pPr>
+              <w:keepNext/>
               <w:jc w:val="center"/>
               <w:rPr>
                 <w:sz w:val="24"/>
@@ -7661,6 +7846,7 @@
           </w:tcPr>
           <w:p>
             <w:pPr>
+              <w:keepNext/>
               <w:jc w:val="center"/>
               <w:rPr>
                 <w:sz w:val="24"/>
@@ -7681,7 +7867,9 @@
       </w:tr>
       <w:tr>
         <w:trPr>
+          <w:cantSplit/>
           <w:jc w:val="center"/>
+          <w:trHeight w:val="510" w:hRule="atLeast"/>
         </w:trPr>
         <w:tc>
           <w:tcPr>
@@ -7750,7 +7938,7 @@
           </w:tcPr>
           <w:p>
             <w:pPr>
-              <w:jc w:val="both"/>
+              <w:jc w:val="left"/>
               <w:rPr>
                 <w:sz w:val="24"/>
                 <w:szCs w:val="24"/>
@@ -7778,7 +7966,7 @@
           </w:tcPr>
           <w:p>
             <w:pPr>
-              <w:jc w:val="both"/>
+              <w:jc w:val="left"/>
               <w:rPr>
                 <w:sz w:val="24"/>
                 <w:szCs w:val="24"/>
@@ -7806,7 +7994,7 @@
           </w:tcPr>
           <w:p>
             <w:pPr>
-              <w:jc w:val="both"/>
+              <w:jc w:val="left"/>
               <w:rPr>
                 <w:sz w:val="24"/>
                 <w:szCs w:val="24"/>
@@ -7850,6 +8038,7 @@
     <w:p>
       <w:pPr>
         <w:pStyle w:val="Heading2"/>
+        <w:keepNext/>
         <w:numPr>
           <w:ilvl w:val="1"/>
           <w:numId w:val="7"/>
@@ -7877,6 +8066,8 @@
       </w:tblGrid>
       <w:tr>
         <w:trPr>
+          <w:cantSplit/>
+          <w:tblHeader/>
           <w:jc w:val="center"/>
         </w:trPr>
         <w:tc>
@@ -7892,6 +8083,7 @@
           </w:tcPr>
           <w:p>
             <w:pPr>
+              <w:keepNext/>
               <w:jc w:val="center"/>
               <w:rPr>
                 <w:sz w:val="24"/>
@@ -7922,6 +8114,7 @@
           </w:tcPr>
           <w:p>
             <w:pPr>
+              <w:keepNext/>
               <w:jc w:val="center"/>
               <w:rPr>
                 <w:sz w:val="24"/>
@@ -7952,6 +8145,7 @@
           </w:tcPr>
           <w:p>
             <w:pPr>
+              <w:keepNext/>
               <w:jc w:val="center"/>
               <w:rPr>
                 <w:sz w:val="24"/>
@@ -7982,6 +8176,7 @@
           </w:tcPr>
           <w:p>
             <w:pPr>
+              <w:keepNext/>
               <w:jc w:val="center"/>
               <w:rPr>
                 <w:sz w:val="24"/>
@@ -8002,7 +8197,9 @@
       </w:tr>
       <w:tr>
         <w:trPr>
+          <w:cantSplit/>
           <w:jc w:val="center"/>
+          <w:trHeight w:val="510" w:hRule="atLeast"/>
         </w:trPr>
         <w:tc>
           <w:tcPr>
@@ -8072,7 +8269,7 @@
           </w:tcPr>
           <w:p>
             <w:pPr>
-              <w:jc w:val="both"/>
+              <w:jc w:val="left"/>
               <w:rPr>
                 <w:sz w:val="24"/>
                 <w:szCs w:val="24"/>
@@ -8100,7 +8297,7 @@
           </w:tcPr>
           <w:p>
             <w:pPr>
-              <w:jc w:val="both"/>
+              <w:jc w:val="left"/>
               <w:rPr>
                 <w:sz w:val="24"/>
                 <w:szCs w:val="24"/>
@@ -8181,6 +8378,7 @@
     <w:p>
       <w:pPr>
         <w:pStyle w:val="Heading2"/>
+        <w:keepNext/>
         <w:numPr>
           <w:ilvl w:val="1"/>
           <w:numId w:val="7"/>
@@ -8208,6 +8406,8 @@
       </w:tblGrid>
       <w:tr>
         <w:trPr>
+          <w:cantSplit/>
+          <w:tblHeader/>
           <w:jc w:val="center"/>
         </w:trPr>
         <w:tc>
@@ -8223,6 +8423,7 @@
           </w:tcPr>
           <w:p>
             <w:pPr>
+              <w:keepNext/>
               <w:jc w:val="center"/>
               <w:rPr>
                 <w:sz w:val="24"/>
@@ -8253,6 +8454,7 @@
           </w:tcPr>
           <w:p>
             <w:pPr>
+              <w:keepNext/>
               <w:jc w:val="center"/>
               <w:rPr>
                 <w:sz w:val="24"/>
@@ -8283,6 +8485,7 @@
           </w:tcPr>
           <w:p>
             <w:pPr>
+              <w:keepNext/>
               <w:jc w:val="center"/>
               <w:rPr>
                 <w:sz w:val="24"/>
@@ -8313,6 +8516,7 @@
           </w:tcPr>
           <w:p>
             <w:pPr>
+              <w:keepNext/>
               <w:jc w:val="center"/>
               <w:rPr>
                 <w:sz w:val="24"/>
@@ -8333,7 +8537,9 @@
       </w:tr>
       <w:tr>
         <w:trPr>
+          <w:cantSplit/>
           <w:jc w:val="center"/>
+          <w:trHeight w:val="510" w:hRule="atLeast"/>
         </w:trPr>
         <w:tc>
           <w:tcPr>
@@ -8403,7 +8609,7 @@
           </w:tcPr>
           <w:p>
             <w:pPr>
-              <w:jc w:val="both"/>
+              <w:jc w:val="left"/>
               <w:rPr>
                 <w:sz w:val="24"/>
                 <w:szCs w:val="24"/>
@@ -8431,7 +8637,7 @@
           </w:tcPr>
           <w:p>
             <w:pPr>
-              <w:jc w:val="both"/>
+              <w:jc w:val="left"/>
               <w:rPr>
                 <w:sz w:val="24"/>
                 <w:szCs w:val="24"/>
@@ -8449,7 +8655,9 @@
       </w:tr>
       <w:tr>
         <w:trPr>
+          <w:cantSplit/>
           <w:jc w:val="center"/>
+          <w:trHeight w:val="510" w:hRule="atLeast"/>
         </w:trPr>
         <w:tc>
           <w:tcPr>
@@ -8519,7 +8727,7 @@
           </w:tcPr>
           <w:p>
             <w:pPr>
-              <w:jc w:val="both"/>
+              <w:jc w:val="left"/>
               <w:rPr>
                 <w:sz w:val="24"/>
                 <w:szCs w:val="24"/>
@@ -8547,7 +8755,7 @@
           </w:tcPr>
           <w:p>
             <w:pPr>
-              <w:jc w:val="both"/>
+              <w:jc w:val="left"/>
               <w:rPr>
                 <w:sz w:val="24"/>
                 <w:szCs w:val="24"/>
@@ -8565,7 +8773,9 @@
       </w:tr>
       <w:tr>
         <w:trPr>
+          <w:cantSplit/>
           <w:jc w:val="center"/>
+          <w:trHeight w:val="510" w:hRule="atLeast"/>
         </w:trPr>
         <w:tc>
           <w:tcPr>
@@ -8635,7 +8845,7 @@
           </w:tcPr>
           <w:p>
             <w:pPr>
-              <w:jc w:val="both"/>
+              <w:jc w:val="left"/>
               <w:rPr>
                 <w:sz w:val="24"/>
                 <w:szCs w:val="24"/>
@@ -8663,7 +8873,7 @@
           </w:tcPr>
           <w:p>
             <w:pPr>
-              <w:jc w:val="both"/>
+              <w:jc w:val="left"/>
               <w:rPr>
                 <w:sz w:val="24"/>
                 <w:szCs w:val="24"/>
@@ -8707,6 +8917,7 @@
     <w:p>
       <w:pPr>
         <w:pStyle w:val="Heading1"/>
+        <w:keepNext/>
         <w:numPr>
           <w:ilvl w:val="0"/>
           <w:numId w:val="7"/>
@@ -8732,6 +8943,8 @@
       </w:tblGrid>
       <w:tr>
         <w:trPr>
+          <w:cantSplit/>
+          <w:tblHeader/>
           <w:jc w:val="center"/>
         </w:trPr>
         <w:tc>
@@ -8747,6 +8960,7 @@
           </w:tcPr>
           <w:p>
             <w:pPr>
+              <w:keepNext/>
               <w:jc w:val="center"/>
               <w:rPr>
                 <w:sz w:val="24"/>
@@ -8777,6 +8991,7 @@
           </w:tcPr>
           <w:p>
             <w:pPr>
+              <w:keepNext/>
               <w:jc w:val="center"/>
               <w:rPr>
                 <w:sz w:val="24"/>
@@ -8797,6 +9012,7 @@
       </w:tr>
       <w:tr>
         <w:trPr>
+          <w:cantSplit/>
           <w:jc w:val="center"/>
         </w:trPr>
         <w:tc>
@@ -8858,6 +9074,7 @@
       </w:tr>
       <w:tr>
         <w:trPr>
+          <w:cantSplit/>
           <w:jc w:val="center"/>
         </w:trPr>
         <w:tc>
@@ -8919,6 +9136,7 @@
       </w:tr>
       <w:tr>
         <w:trPr>
+          <w:cantSplit/>
           <w:jc w:val="center"/>
         </w:trPr>
         <w:tc>
@@ -8980,6 +9198,7 @@
       </w:tr>
       <w:tr>
         <w:trPr>
+          <w:cantSplit/>
           <w:jc w:val="center"/>
         </w:trPr>
         <w:tc>
@@ -9041,6 +9260,7 @@
       </w:tr>
       <w:tr>
         <w:trPr>
+          <w:cantSplit/>
           <w:jc w:val="center"/>
         </w:trPr>
         <w:tc>
@@ -9141,6 +9361,7 @@
     <w:p>
       <w:pPr>
         <w:pStyle w:val="Heading2"/>
+        <w:keepNext/>
         <w:numPr>
           <w:ilvl w:val="1"/>
           <w:numId w:val="7"/>
@@ -9167,6 +9388,8 @@
       </w:tblGrid>
       <w:tr>
         <w:trPr>
+          <w:cantSplit/>
+          <w:tblHeader/>
           <w:jc w:val="center"/>
         </w:trPr>
         <w:tc>
@@ -9182,6 +9405,7 @@
           </w:tcPr>
           <w:p>
             <w:pPr>
+              <w:keepNext/>
               <w:jc w:val="center"/>
               <w:rPr>
                 <w:sz w:val="24"/>
@@ -9195,7 +9419,7 @@
                 <w:sz w:val="24"/>
                 <w:szCs w:val="24"/>
               </w:rPr>
-              <w:t>Rekaman</w:t>
+              <w:t>Record</w:t>
             </w:r>
           </w:p>
         </w:tc>
@@ -9212,6 +9436,7 @@
           </w:tcPr>
           <w:p>
             <w:pPr>
+              <w:keepNext/>
               <w:jc w:val="center"/>
               <w:rPr>
                 <w:sz w:val="24"/>
@@ -9242,6 +9467,7 @@
           </w:tcPr>
           <w:p>
             <w:pPr>
+              <w:keepNext/>
               <w:jc w:val="center"/>
               <w:rPr>
                 <w:sz w:val="24"/>
@@ -9262,6 +9488,7 @@
       </w:tr>
       <w:tr>
         <w:trPr>
+          <w:cantSplit/>
           <w:jc w:val="center"/>
         </w:trPr>
         <w:tc>
@@ -9333,7 +9560,7 @@
           </w:tcPr>
           <w:p>
             <w:pPr>
-              <w:jc w:val="both"/>
+              <w:jc w:val="left"/>
               <w:rPr>
                 <w:sz w:val="24"/>
                 <w:szCs w:val="24"/>
@@ -9378,6 +9605,7 @@
     <w:p>
       <w:pPr>
         <w:pStyle w:val="Heading2"/>
+        <w:keepNext/>
         <w:numPr>
           <w:ilvl w:val="1"/>
           <w:numId w:val="7"/>
@@ -9403,6 +9631,8 @@
       </w:tblGrid>
       <w:tr>
         <w:trPr>
+          <w:cantSplit/>
+          <w:tblHeader/>
           <w:jc w:val="center"/>
         </w:trPr>
         <w:tc>
@@ -9418,6 +9648,7 @@
           </w:tcPr>
           <w:p>
             <w:pPr>
+              <w:keepNext/>
               <w:jc w:val="center"/>
               <w:rPr>
                 <w:sz w:val="24"/>
@@ -9448,6 +9679,7 @@
           </w:tcPr>
           <w:p>
             <w:pPr>
+              <w:keepNext/>
               <w:jc w:val="center"/>
               <w:rPr>
                 <w:sz w:val="24"/>
@@ -9468,6 +9700,7 @@
       </w:tr>
       <w:tr>
         <w:trPr>
+          <w:cantSplit/>
           <w:jc w:val="center"/>
         </w:trPr>
         <w:tc>
@@ -9529,6 +9762,7 @@
       </w:tr>
       <w:tr>
         <w:trPr>
+          <w:cantSplit/>
           <w:jc w:val="center"/>
         </w:trPr>
         <w:tc>

</xml_diff>